<commit_message>
feat: grouped skills and light sidebar in modern CV
</commit_message>
<xml_diff>
--- a/public/cv/english/CV-modern.docx
+++ b/public/cv/english/CV-modern.docx
@@ -164,7 +164,7 @@
         <w:rPr>
           <w:lang w:val="en"/>
         </w:rPr>
-        <w:t xml:space="preserve">Java, C#, TypeScript, SQL, HTML, CSS</w:t>
+        <w:t xml:space="preserve">Programming Languages</w:t>
       </w:r>
     </w:p>
     <w:p>
@@ -179,7 +179,112 @@
         <w:rPr>
           <w:lang w:val="en"/>
         </w:rPr>
-        <w:t xml:space="preserve">React, Next.js, React Native, Flutter, NestJS, REST API, .NET, .NET Web API, MS SQL Server, PostgreSQL, Expo</w:t>
+        <w:t xml:space="preserve">Java, C#, TypeScript</w:t>
+      </w:r>
+    </w:p>
+    <w:p>
+      <w:pPr>
+        <w:pStyle w:val="Compact"/>
+        <w:numPr>
+          <w:ilvl w:val="0"/>
+          <w:numId w:val="1002"/>
+        </w:numPr>
+      </w:pPr>
+      <w:r>
+        <w:rPr>
+          <w:lang w:val="en"/>
+        </w:rPr>
+        <w:t xml:space="preserve">SQL, HTML, CSS</w:t>
+      </w:r>
+    </w:p>
+    <w:p>
+      <w:pPr>
+        <w:pStyle w:val="Compact"/>
+        <w:numPr>
+          <w:ilvl w:val="0"/>
+          <w:numId w:val="1002"/>
+        </w:numPr>
+      </w:pPr>
+      <w:r>
+        <w:rPr>
+          <w:lang w:val="en"/>
+        </w:rPr>
+        <w:t xml:space="preserve">Frameworks &amp; Technologies</w:t>
+      </w:r>
+    </w:p>
+    <w:p>
+      <w:pPr>
+        <w:pStyle w:val="Compact"/>
+        <w:numPr>
+          <w:ilvl w:val="0"/>
+          <w:numId w:val="1002"/>
+        </w:numPr>
+      </w:pPr>
+      <w:r>
+        <w:rPr>
+          <w:lang w:val="en"/>
+        </w:rPr>
+        <w:t xml:space="preserve">Frontend: React, Next.js</w:t>
+      </w:r>
+    </w:p>
+    <w:p>
+      <w:pPr>
+        <w:pStyle w:val="Compact"/>
+        <w:numPr>
+          <w:ilvl w:val="0"/>
+          <w:numId w:val="1002"/>
+        </w:numPr>
+      </w:pPr>
+      <w:r>
+        <w:rPr>
+          <w:lang w:val="en"/>
+        </w:rPr>
+        <w:t xml:space="preserve">Mobile: React Native, Flutter, Expo</w:t>
+      </w:r>
+    </w:p>
+    <w:p>
+      <w:pPr>
+        <w:pStyle w:val="Compact"/>
+        <w:numPr>
+          <w:ilvl w:val="0"/>
+          <w:numId w:val="1002"/>
+        </w:numPr>
+      </w:pPr>
+      <w:r>
+        <w:rPr>
+          <w:lang w:val="en"/>
+        </w:rPr>
+        <w:t xml:space="preserve">Backend: NestJS, .NET, .NET Web API, REST API</w:t>
+      </w:r>
+    </w:p>
+    <w:p>
+      <w:pPr>
+        <w:pStyle w:val="Compact"/>
+        <w:numPr>
+          <w:ilvl w:val="0"/>
+          <w:numId w:val="1002"/>
+        </w:numPr>
+      </w:pPr>
+      <w:r>
+        <w:rPr>
+          <w:lang w:val="en"/>
+        </w:rPr>
+        <w:t xml:space="preserve">Databases: PostgreSQL, MS SQL Server</w:t>
+      </w:r>
+    </w:p>
+    <w:p>
+      <w:pPr>
+        <w:pStyle w:val="Compact"/>
+        <w:numPr>
+          <w:ilvl w:val="0"/>
+          <w:numId w:val="1002"/>
+        </w:numPr>
+      </w:pPr>
+      <w:r>
+        <w:rPr>
+          <w:lang w:val="en"/>
+        </w:rPr>
+        <w:t xml:space="preserve">Tools &amp; Software</w:t>
       </w:r>
     </w:p>
     <w:p>

</xml_diff>